<commit_message>
docs(papers): COMPSAC round 4 and hold-out D; AsianPLoP one-line summaries shortened
COMPSAC: hold-out D in Table IV, fifth column in the transfer table,
round-4 paragraph, rule-trigger reading answering "is this enumeration",
56 rules throughout. AsianPLoP: the four one-line summaries shortened
(edit made outside this session, kept as found).

Co-Authored-By: Claude Opus 5.5 <noreply@anthropic.com>
</commit_message>
<xml_diff>
--- a/docs/papers/asianplop-2027-zh.docx
+++ b/docs/papers/asianplop-2027-zh.docx
@@ -2260,7 +2260,7 @@
         <w:t xml:space="preserve">一句話摘要：</w:t>
       </w:r>
       <w:r>
-        <w:t xml:space="preserve">先主動產生流量，讓執行期觀測看到平常沒被走到的路徑；再把連線設定、程式碼、執行期觀測與文件的結果，以「來源服務 → 目標服務」為鍵，合併成同一張圖，每條邊保留它來自哪些來源。</w:t>
+        <w:t xml:space="preserve">用流量補齊執行期觀測，再把各來源的結果合併成一張圖，每條邊記下出處。</w:t>
       </w:r>
     </w:p>
     <w:p>
@@ -3260,7 +3260,7 @@
         <w:t xml:space="preserve">一句話摘要：</w:t>
       </w:r>
       <w:r>
-        <w:t xml:space="preserve">讓每條邊或節點帶一個「實測」或「推測」標記並畫成不同樣子；同一條邊有了更強的證據，就取代推測的版本。</w:t>
+        <w:t xml:space="preserve">每條邊標上「實測」或「推測」並畫成不同樣子，有了更強的證據就取代推測。</w:t>
       </w:r>
     </w:p>
     <w:p>
@@ -4214,7 +4214,7 @@
         <w:t xml:space="preserve">一句話摘要：</w:t>
       </w:r>
       <w:r>
-        <w:t xml:space="preserve">規則判斷不了某個名稱該對應到誰時，不要丟掉、也不要模糊比對；把它變成一個具體的問題（附候選）交給熟悉系統的人，答案存下來給下一次用。</w:t>
+        <w:t xml:space="preserve">規則判斷不了的名稱，附上候選問熟悉系統的人，答案存下來重複使用。</w:t>
       </w:r>
     </w:p>
     <w:p>
@@ -5090,7 +5090,7 @@
         <w:t xml:space="preserve">一句話摘要：</w:t>
       </w:r>
       <w:r>
-        <w:t xml:space="preserve">每次分析先建一份統一模型；能由程式從模型算出的事實（有哪些相依關係、量測到幾次、覆蓋率多少、哪些來源這次沒收集）由程式產生，LLM 只負責解釋這些事實、提出詮釋與建議，不讓它重述事實；沒收集到的資料在模型裡是「未知」，程式照寫「未量測」而不是 0，也不交給 LLM 猜。</w:t>
+        <w:t xml:space="preserve">事實由程式從統一模型產生，LLM 只負責解釋；沒收集到的資料寫「未量測」，不寫 0。</w:t>
       </w:r>
     </w:p>
     <w:p>

</xml_diff>